<commit_message>
#559 Always add new numbering to output document
During numIdCopy, if numbering isn't found in template, look it up in generated doc

adapt test templates for 559 back to 3.3.5

Signed-off-by: Erwann Traisnel <erwann.traisnel@obeo.fr>
</commit_message>
<xml_diff>
--- a/tests/org.obeonetwork.m2doc.tests/resources/template/bug533/bug533-expected-generation.docx
+++ b/tests/org.obeonetwork.m2doc.tests/resources/template/bug533/bug533-expected-generation.docx
@@ -1,12 +1,12 @@
 
 <file path=word/document.xml><?xml version="1.0" encoding="utf-8"?>
-<w:document xmlns:wpc="http://schemas.microsoft.com/office/word/2010/wordprocessingCanvas" xmlns:cx="http://schemas.microsoft.com/office/drawing/2014/chartex" xmlns:cx1="http://schemas.microsoft.com/office/drawing/2015/9/8/chartex" xmlns:cx2="http://schemas.microsoft.com/office/drawing/2015/10/21/chartex" xmlns:cx3="http://schemas.microsoft.com/office/drawing/2016/5/9/chartex" xmlns:cx4="http://schemas.microsoft.com/office/drawing/2016/5/10/chartex" xmlns:cx5="http://schemas.microsoft.com/office/drawing/2016/5/11/chartex" xmlns:cx6="http://schemas.microsoft.com/office/drawing/2016/5/12/chartex" xmlns:cx7="http://schemas.microsoft.com/office/drawing/2016/5/13/chartex" xmlns:cx8="http://schemas.microsoft.com/office/drawing/2016/5/14/chartex" xmlns:mc="http://schemas.openxmlformats.org/markup-compatibility/2006" xmlns:aink="http://schemas.microsoft.com/office/drawing/2016/ink" xmlns:am3d="http://schemas.microsoft.com/office/drawing/2017/model3d" xmlns:o="urn:schemas-microsoft-com:office:office" xmlns:oel="http://schemas.microsoft.com/office/2019/extlst" xmlns:r="http://schemas.openxmlformats.org/officeDocument/2006/relationships" xmlns:m="http://schemas.openxmlformats.org/officeDocument/2006/math" xmlns:v="urn:schemas-microsoft-com:vml" xmlns:wp14="http://schemas.microsoft.com/office/word/2010/wordprocessingDrawing" xmlns:wp="http://schemas.openxmlformats.org/drawingml/2006/wordprocessingDrawing" xmlns:w10="urn:schemas-microsoft-com:office:word" xmlns:w="http://schemas.openxmlformats.org/wordprocessingml/2006/main" xmlns:w14="http://schemas.microsoft.com/office/word/2010/wordml" xmlns:w15="http://schemas.microsoft.com/office/word/2012/wordml" xmlns:w16cex="http://schemas.microsoft.com/office/word/2018/wordml/cex" xmlns:w16cid="http://schemas.microsoft.com/office/word/2016/wordml/cid" xmlns:w16="http://schemas.microsoft.com/office/word/2018/wordml" xmlns:w16du="http://schemas.microsoft.com/office/word/2023/wordml/word16du" xmlns:w16sdtdh="http://schemas.microsoft.com/office/word/2020/wordml/sdtdatahash" xmlns:w16se="http://schemas.microsoft.com/office/word/2015/wordml/symex" xmlns:wpg="http://schemas.microsoft.com/office/word/2010/wordprocessingGroup" xmlns:wpi="http://schemas.microsoft.com/office/word/2010/wordprocessingInk" xmlns:wne="http://schemas.microsoft.com/office/word/2006/wordml" xmlns:wps="http://schemas.microsoft.com/office/word/2010/wordprocessingShape" mc:Ignorable="w14 w15 w16se w16cid w16 w16cex w16sdtdh w16du wp14">
+<w:document xmlns:wpc="http://schemas.microsoft.com/office/word/2010/wordprocessingCanvas" xmlns:cx="http://schemas.microsoft.com/office/drawing/2014/chartex" xmlns:cx1="http://schemas.microsoft.com/office/drawing/2015/9/8/chartex" xmlns:cx2="http://schemas.microsoft.com/office/drawing/2015/10/21/chartex" xmlns:cx3="http://schemas.microsoft.com/office/drawing/2016/5/9/chartex" xmlns:cx4="http://schemas.microsoft.com/office/drawing/2016/5/10/chartex" xmlns:cx5="http://schemas.microsoft.com/office/drawing/2016/5/11/chartex" xmlns:cx6="http://schemas.microsoft.com/office/drawing/2016/5/12/chartex" xmlns:cx7="http://schemas.microsoft.com/office/drawing/2016/5/13/chartex" xmlns:cx8="http://schemas.microsoft.com/office/drawing/2016/5/14/chartex" xmlns:mc="http://schemas.openxmlformats.org/markup-compatibility/2006" xmlns:aink="http://schemas.microsoft.com/office/drawing/2016/ink" xmlns:am3d="http://schemas.microsoft.com/office/drawing/2017/model3d" xmlns:o="urn:schemas-microsoft-com:office:office" xmlns:oel="http://schemas.microsoft.com/office/2019/extlst" xmlns:r="http://schemas.openxmlformats.org/officeDocument/2006/relationships" xmlns:m="http://schemas.openxmlformats.org/officeDocument/2006/math" xmlns:v="urn:schemas-microsoft-com:vml" xmlns:wp14="http://schemas.microsoft.com/office/word/2010/wordprocessingDrawing" xmlns:wp="http://schemas.openxmlformats.org/drawingml/2006/wordprocessingDrawing" xmlns:w10="urn:schemas-microsoft-com:office:word" xmlns:w="http://schemas.openxmlformats.org/wordprocessingml/2006/main" xmlns:w14="http://schemas.microsoft.com/office/word/2010/wordml" xmlns:w15="http://schemas.microsoft.com/office/word/2012/wordml" xmlns:w16cex="http://schemas.microsoft.com/office/word/2018/wordml/cex" xmlns:w16cid="http://schemas.microsoft.com/office/word/2016/wordml/cid" xmlns:w16="http://schemas.microsoft.com/office/word/2018/wordml" xmlns:w16du="http://schemas.microsoft.com/office/word/2023/wordml/word16du" xmlns:w16sdtdh="http://schemas.microsoft.com/office/word/2020/wordml/sdtdatahash" xmlns:w16sdtfl="http://schemas.microsoft.com/office/word/2024/wordml/sdtformatlock" xmlns:w16se="http://schemas.microsoft.com/office/word/2015/wordml/symex" xmlns:wpg="http://schemas.microsoft.com/office/word/2010/wordprocessingGroup" xmlns:wpi="http://schemas.microsoft.com/office/word/2010/wordprocessingInk" xmlns:wne="http://schemas.microsoft.com/office/word/2006/wordml" xmlns:wps="http://schemas.microsoft.com/office/word/2010/wordprocessingShape" mc:Ignorable="w14 w15 w16se w16cid w16 w16cex w16sdtdh w16sdtfl w16du wp14">
   <w:body>
     <w:p>
       <w:pPr>
-        <w:pStyle w:val="Ttulo1"/>
+        <w:pStyle w:val="Titre1"/>
         <w:rPr>
-          <w:rStyle w:val="CdigoHTML"/>
+          <w:rStyle w:val="CodeHTML"/>
           <w:rFonts w:ascii="Times New Roman" w:hAnsi="Times New Roman" w:cs="Times New Roman"/>
           <w:sz w:val="48"/>
           <w:szCs w:val="48"/>
@@ -40,13 +40,13 @@
     </w:p>
     <w:p>
       <w:pPr>
-        <w:pStyle w:val="Prrafodelista"/>
+        <w:pStyle w:val="Paragraphedeliste"/>
         <w:numPr>
           <w:ilvl w:val="0"/>
-          <w:numId w:val="7"/>
+          <w:numId w:val="8"/>
         </w:numPr>
         <w:rPr>
-          <w:rStyle w:val="CdigoHTML"/>
+          <w:rStyle w:val="CodeHTML"/>
           <w:rFonts w:ascii="Open Sans" w:eastAsiaTheme="minorHAnsi" w:hAnsi="Open Sans" w:cs="Open Sans"/>
           <w:sz w:val="22"/>
           <w:szCs w:val="22"/>
@@ -54,7 +54,7 @@
       </w:pPr>
       <w:r>
         <w:rPr>
-          <w:rStyle w:val="CdigoHTML"/>
+          <w:rStyle w:val="CodeHTML"/>
           <w:rFonts w:ascii="Open Sans" w:eastAsiaTheme="minorHAnsi" w:hAnsi="Open Sans" w:cs="Open Sans"/>
           <w:sz w:val="22"/>
           <w:szCs w:val="22"/>
@@ -64,13 +64,13 @@
     </w:p>
     <w:p>
       <w:pPr>
-        <w:pStyle w:val="Prrafodelista"/>
+        <w:pStyle w:val="Paragraphedeliste"/>
         <w:numPr>
           <w:ilvl w:val="0"/>
-          <w:numId w:val="7"/>
+          <w:numId w:val="8"/>
         </w:numPr>
         <w:rPr>
-          <w:rStyle w:val="CdigoHTML"/>
+          <w:rStyle w:val="CodeHTML"/>
           <w:rFonts w:ascii="Open Sans" w:eastAsiaTheme="minorHAnsi" w:hAnsi="Open Sans" w:cs="Open Sans"/>
           <w:sz w:val="22"/>
           <w:szCs w:val="22"/>
@@ -78,7 +78,7 @@
       </w:pPr>
       <w:r>
         <w:rPr>
-          <w:rStyle w:val="CdigoHTML"/>
+          <w:rStyle w:val="CodeHTML"/>
           <w:rFonts w:ascii="Open Sans" w:eastAsiaTheme="minorHAnsi" w:hAnsi="Open Sans" w:cs="Open Sans"/>
           <w:sz w:val="22"/>
           <w:szCs w:val="22"/>
@@ -88,13 +88,13 @@
     </w:p>
     <w:p>
       <w:pPr>
-        <w:pStyle w:val="Prrafodelista"/>
+        <w:pStyle w:val="Paragraphedeliste"/>
         <w:numPr>
           <w:ilvl w:val="0"/>
-          <w:numId w:val="7"/>
+          <w:numId w:val="8"/>
         </w:numPr>
         <w:rPr>
-          <w:rStyle w:val="CdigoHTML"/>
+          <w:rStyle w:val="CodeHTML"/>
           <w:rFonts w:ascii="Open Sans" w:eastAsiaTheme="minorHAnsi" w:hAnsi="Open Sans" w:cs="Open Sans"/>
           <w:sz w:val="22"/>
           <w:szCs w:val="22"/>
@@ -102,7 +102,7 @@
       </w:pPr>
       <w:r>
         <w:rPr>
-          <w:rStyle w:val="CdigoHTML"/>
+          <w:rStyle w:val="CodeHTML"/>
           <w:rFonts w:ascii="Open Sans" w:eastAsiaTheme="minorHAnsi" w:hAnsi="Open Sans" w:cs="Open Sans"/>
           <w:sz w:val="22"/>
           <w:szCs w:val="22"/>
@@ -121,8 +121,121 @@
 </file>
 
 <file path=word/numbering.xml><?xml version="1.0" encoding="utf-8"?>
-<w:numbering xmlns:wpc="http://schemas.microsoft.com/office/word/2010/wordprocessingCanvas" xmlns:cx="http://schemas.microsoft.com/office/drawing/2014/chartex" xmlns:cx1="http://schemas.microsoft.com/office/drawing/2015/9/8/chartex" xmlns:cx2="http://schemas.microsoft.com/office/drawing/2015/10/21/chartex" xmlns:cx3="http://schemas.microsoft.com/office/drawing/2016/5/9/chartex" xmlns:cx4="http://schemas.microsoft.com/office/drawing/2016/5/10/chartex" xmlns:cx5="http://schemas.microsoft.com/office/drawing/2016/5/11/chartex" xmlns:cx6="http://schemas.microsoft.com/office/drawing/2016/5/12/chartex" xmlns:cx7="http://schemas.microsoft.com/office/drawing/2016/5/13/chartex" xmlns:cx8="http://schemas.microsoft.com/office/drawing/2016/5/14/chartex" xmlns:mc="http://schemas.openxmlformats.org/markup-compatibility/2006" xmlns:aink="http://schemas.microsoft.com/office/drawing/2016/ink" xmlns:am3d="http://schemas.microsoft.com/office/drawing/2017/model3d" xmlns:o="urn:schemas-microsoft-com:office:office" xmlns:oel="http://schemas.microsoft.com/office/2019/extlst" xmlns:r="http://schemas.openxmlformats.org/officeDocument/2006/relationships" xmlns:m="http://schemas.openxmlformats.org/officeDocument/2006/math" xmlns:v="urn:schemas-microsoft-com:vml" xmlns:wp14="http://schemas.microsoft.com/office/word/2010/wordprocessingDrawing" xmlns:wp="http://schemas.openxmlformats.org/drawingml/2006/wordprocessingDrawing" xmlns:w10="urn:schemas-microsoft-com:office:word" xmlns:w="http://schemas.openxmlformats.org/wordprocessingml/2006/main" xmlns:w14="http://schemas.microsoft.com/office/word/2010/wordml" xmlns:w15="http://schemas.microsoft.com/office/word/2012/wordml" xmlns:w16cex="http://schemas.microsoft.com/office/word/2018/wordml/cex" xmlns:w16cid="http://schemas.microsoft.com/office/word/2016/wordml/cid" xmlns:w16="http://schemas.microsoft.com/office/word/2018/wordml" xmlns:w16du="http://schemas.microsoft.com/office/word/2023/wordml/word16du" xmlns:w16sdtdh="http://schemas.microsoft.com/office/word/2020/wordml/sdtdatahash" xmlns:w16se="http://schemas.microsoft.com/office/word/2015/wordml/symex" xmlns:wpg="http://schemas.microsoft.com/office/word/2010/wordprocessingGroup" xmlns:wpi="http://schemas.microsoft.com/office/word/2010/wordprocessingInk" xmlns:wne="http://schemas.microsoft.com/office/word/2006/wordml" xmlns:wps="http://schemas.microsoft.com/office/word/2010/wordprocessingShape" mc:Ignorable="w14 w15 w16se w16cid w16 w16cex w16sdtdh w16du wp14">
+<w:numbering xmlns:wpc="http://schemas.microsoft.com/office/word/2010/wordprocessingCanvas" xmlns:cx="http://schemas.microsoft.com/office/drawing/2014/chartex" xmlns:cx1="http://schemas.microsoft.com/office/drawing/2015/9/8/chartex" xmlns:cx2="http://schemas.microsoft.com/office/drawing/2015/10/21/chartex" xmlns:cx3="http://schemas.microsoft.com/office/drawing/2016/5/9/chartex" xmlns:cx4="http://schemas.microsoft.com/office/drawing/2016/5/10/chartex" xmlns:cx5="http://schemas.microsoft.com/office/drawing/2016/5/11/chartex" xmlns:cx6="http://schemas.microsoft.com/office/drawing/2016/5/12/chartex" xmlns:cx7="http://schemas.microsoft.com/office/drawing/2016/5/13/chartex" xmlns:cx8="http://schemas.microsoft.com/office/drawing/2016/5/14/chartex" xmlns:mc="http://schemas.openxmlformats.org/markup-compatibility/2006" xmlns:aink="http://schemas.microsoft.com/office/drawing/2016/ink" xmlns:am3d="http://schemas.microsoft.com/office/drawing/2017/model3d" xmlns:o="urn:schemas-microsoft-com:office:office" xmlns:oel="http://schemas.microsoft.com/office/2019/extlst" xmlns:r="http://schemas.openxmlformats.org/officeDocument/2006/relationships" xmlns:m="http://schemas.openxmlformats.org/officeDocument/2006/math" xmlns:v="urn:schemas-microsoft-com:vml" xmlns:wp14="http://schemas.microsoft.com/office/word/2010/wordprocessingDrawing" xmlns:wp="http://schemas.openxmlformats.org/drawingml/2006/wordprocessingDrawing" xmlns:w10="urn:schemas-microsoft-com:office:word" xmlns:w="http://schemas.openxmlformats.org/wordprocessingml/2006/main" xmlns:w14="http://schemas.microsoft.com/office/word/2010/wordml" xmlns:w15="http://schemas.microsoft.com/office/word/2012/wordml" xmlns:w16cex="http://schemas.microsoft.com/office/word/2018/wordml/cex" xmlns:w16cid="http://schemas.microsoft.com/office/word/2016/wordml/cid" xmlns:w16="http://schemas.microsoft.com/office/word/2018/wordml" xmlns:w16du="http://schemas.microsoft.com/office/word/2023/wordml/word16du" xmlns:w16sdtdh="http://schemas.microsoft.com/office/word/2020/wordml/sdtdatahash" xmlns:w16sdtfl="http://schemas.microsoft.com/office/word/2024/wordml/sdtformatlock" xmlns:w16se="http://schemas.microsoft.com/office/word/2015/wordml/symex" xmlns:wpg="http://schemas.microsoft.com/office/word/2010/wordprocessingGroup" xmlns:wpi="http://schemas.microsoft.com/office/word/2010/wordprocessingInk" xmlns:wne="http://schemas.microsoft.com/office/word/2006/wordml" xmlns:wps="http://schemas.microsoft.com/office/word/2010/wordprocessingShape" mc:Ignorable="w14 w15 w16se w16cid w16 w16cex w16sdtdh w16sdtfl w16du wp14">
   <w:abstractNum w:abstractNumId="0" w15:restartNumberingAfterBreak="0">
+    <w:nsid w:val="125867A3"/>
+    <w:multiLevelType w:val="hybridMultilevel"/>
+    <w:tmpl w:val="5300A64A"/>
+    <w:lvl w:ilvl="0" w:tplc="040C0001">
+      <w:start w:val="1"/>
+      <w:numFmt w:val="bullet"/>
+      <w:lvlText w:val=""/>
+      <w:lvlJc w:val="left"/>
+      <w:pPr>
+        <w:ind w:left="2136" w:hanging="360"/>
+      </w:pPr>
+      <w:rPr>
+        <w:rFonts w:ascii="Symbol" w:hAnsi="Symbol" w:hint="default"/>
+      </w:rPr>
+    </w:lvl>
+    <w:lvl w:ilvl="1" w:tplc="040C0003" w:tentative="1">
+      <w:start w:val="1"/>
+      <w:numFmt w:val="bullet"/>
+      <w:lvlText w:val="o"/>
+      <w:lvlJc w:val="left"/>
+      <w:pPr>
+        <w:ind w:left="2856" w:hanging="360"/>
+      </w:pPr>
+      <w:rPr>
+        <w:rFonts w:ascii="Courier New" w:hAnsi="Courier New" w:cs="Courier New" w:hint="default"/>
+      </w:rPr>
+    </w:lvl>
+    <w:lvl w:ilvl="2" w:tplc="040C0005" w:tentative="1">
+      <w:start w:val="1"/>
+      <w:numFmt w:val="bullet"/>
+      <w:lvlText w:val=""/>
+      <w:lvlJc w:val="left"/>
+      <w:pPr>
+        <w:ind w:left="3576" w:hanging="360"/>
+      </w:pPr>
+      <w:rPr>
+        <w:rFonts w:ascii="Wingdings" w:hAnsi="Wingdings" w:hint="default"/>
+      </w:rPr>
+    </w:lvl>
+    <w:lvl w:ilvl="3" w:tplc="040C0001" w:tentative="1">
+      <w:start w:val="1"/>
+      <w:numFmt w:val="bullet"/>
+      <w:lvlText w:val=""/>
+      <w:lvlJc w:val="left"/>
+      <w:pPr>
+        <w:ind w:left="4296" w:hanging="360"/>
+      </w:pPr>
+      <w:rPr>
+        <w:rFonts w:ascii="Symbol" w:hAnsi="Symbol" w:hint="default"/>
+      </w:rPr>
+    </w:lvl>
+    <w:lvl w:ilvl="4" w:tplc="040C0003" w:tentative="1">
+      <w:start w:val="1"/>
+      <w:numFmt w:val="bullet"/>
+      <w:lvlText w:val="o"/>
+      <w:lvlJc w:val="left"/>
+      <w:pPr>
+        <w:ind w:left="5016" w:hanging="360"/>
+      </w:pPr>
+      <w:rPr>
+        <w:rFonts w:ascii="Courier New" w:hAnsi="Courier New" w:cs="Courier New" w:hint="default"/>
+      </w:rPr>
+    </w:lvl>
+    <w:lvl w:ilvl="5" w:tplc="040C0005" w:tentative="1">
+      <w:start w:val="1"/>
+      <w:numFmt w:val="bullet"/>
+      <w:lvlText w:val=""/>
+      <w:lvlJc w:val="left"/>
+      <w:pPr>
+        <w:ind w:left="5736" w:hanging="360"/>
+      </w:pPr>
+      <w:rPr>
+        <w:rFonts w:ascii="Wingdings" w:hAnsi="Wingdings" w:hint="default"/>
+      </w:rPr>
+    </w:lvl>
+    <w:lvl w:ilvl="6" w:tplc="040C0001" w:tentative="1">
+      <w:start w:val="1"/>
+      <w:numFmt w:val="bullet"/>
+      <w:lvlText w:val=""/>
+      <w:lvlJc w:val="left"/>
+      <w:pPr>
+        <w:ind w:left="6456" w:hanging="360"/>
+      </w:pPr>
+      <w:rPr>
+        <w:rFonts w:ascii="Symbol" w:hAnsi="Symbol" w:hint="default"/>
+      </w:rPr>
+    </w:lvl>
+    <w:lvl w:ilvl="7" w:tplc="040C0003" w:tentative="1">
+      <w:start w:val="1"/>
+      <w:numFmt w:val="bullet"/>
+      <w:lvlText w:val="o"/>
+      <w:lvlJc w:val="left"/>
+      <w:pPr>
+        <w:ind w:left="7176" w:hanging="360"/>
+      </w:pPr>
+      <w:rPr>
+        <w:rFonts w:ascii="Courier New" w:hAnsi="Courier New" w:cs="Courier New" w:hint="default"/>
+      </w:rPr>
+    </w:lvl>
+    <w:lvl w:ilvl="8" w:tplc="040C0005" w:tentative="1">
+      <w:start w:val="1"/>
+      <w:numFmt w:val="bullet"/>
+      <w:lvlText w:val=""/>
+      <w:lvlJc w:val="left"/>
+      <w:pPr>
+        <w:ind w:left="7896" w:hanging="360"/>
+      </w:pPr>
+      <w:rPr>
+        <w:rFonts w:ascii="Wingdings" w:hAnsi="Wingdings" w:hint="default"/>
+      </w:rPr>
+    </w:lvl>
+  </w:abstractNum>
+  <w:abstractNum w:abstractNumId="1" w15:restartNumberingAfterBreak="0">
     <w:nsid w:val="2EDC6A59"/>
     <w:multiLevelType w:val="hybridMultilevel"/>
     <w:tmpl w:val="336AC4C8"/>
@@ -235,7 +348,7 @@
       </w:rPr>
     </w:lvl>
   </w:abstractNum>
-  <w:abstractNum w:abstractNumId="1" w15:restartNumberingAfterBreak="0">
+  <w:abstractNum w:abstractNumId="2" w15:restartNumberingAfterBreak="0">
     <w:nsid w:val="2FB204C4"/>
     <w:multiLevelType w:val="hybridMultilevel"/>
     <w:tmpl w:val="E07EE5D8"/>
@@ -348,7 +461,7 @@
       </w:rPr>
     </w:lvl>
   </w:abstractNum>
-  <w:abstractNum w:abstractNumId="2" w15:restartNumberingAfterBreak="0">
+  <w:abstractNum w:abstractNumId="3" w15:restartNumberingAfterBreak="0">
     <w:nsid w:val="40E72275"/>
     <w:multiLevelType w:val="hybridMultilevel"/>
     <w:tmpl w:val="3BBE604C"/>
@@ -461,14 +574,14 @@
       </w:rPr>
     </w:lvl>
   </w:abstractNum>
-  <w:abstractNum w:abstractNumId="3" w15:restartNumberingAfterBreak="0">
+  <w:abstractNum w:abstractNumId="4" w15:restartNumberingAfterBreak="0">
     <w:nsid w:val="4B99013F"/>
     <w:multiLevelType w:val="multilevel"/>
     <w:tmpl w:val="FFBEE3D6"/>
     <w:lvl w:ilvl="0">
       <w:start w:val="1"/>
       <w:numFmt w:val="bullet"/>
-      <w:pStyle w:val="Prrafodelista"/>
+      <w:pStyle w:val="Paragraphedeliste"/>
       <w:lvlText w:val=""/>
       <w:lvlJc w:val="left"/>
       <w:pPr>
@@ -611,7 +724,7 @@
       </w:rPr>
     </w:lvl>
   </w:abstractNum>
-  <w:abstractNum w:abstractNumId="4" w15:restartNumberingAfterBreak="0">
+  <w:abstractNum w:abstractNumId="5" w15:restartNumberingAfterBreak="0">
     <w:nsid w:val="4F6229CB"/>
     <w:multiLevelType w:val="hybridMultilevel"/>
     <w:tmpl w:val="1C762940"/>
@@ -724,7 +837,7 @@
       </w:rPr>
     </w:lvl>
   </w:abstractNum>
-  <w:abstractNum w:abstractNumId="5" w15:restartNumberingAfterBreak="0">
+  <w:abstractNum w:abstractNumId="6" w15:restartNumberingAfterBreak="0">
     <w:nsid w:val="585D3BBE"/>
     <w:multiLevelType w:val="hybridMultilevel"/>
     <w:tmpl w:val="CD52831A"/>
@@ -837,7 +950,7 @@
       </w:rPr>
     </w:lvl>
   </w:abstractNum>
-  <w:abstractNum w:abstractNumId="6" w15:restartNumberingAfterBreak="0">
+  <w:abstractNum w:abstractNumId="7" w15:restartNumberingAfterBreak="0">
     <w:nsid w:val="62FE6C49"/>
     <w:multiLevelType w:val="hybridMultilevel"/>
     <w:tmpl w:val="676AEA46"/>
@@ -950,113 +1063,113 @@
       </w:rPr>
     </w:lvl>
   </w:abstractNum>
-  <w:abstractNum w:abstractNumId="7" w15:restartNumberingAfterBreak="0">
-    <w:nsid w:val="2EDC6A59"/>
+  <w:abstractNum w:abstractNumId="8" w15:restartNumberingAfterBreak="0">
+    <w:nsid w:val="125867A3"/>
     <w:multiLevelType w:val="hybridMultilevel"/>
-    <w:tmpl w:val="336AC4C8"/>
-    <w:lvl w:ilvl="0" w:tplc="0C0A0001">
-      <w:start w:val="1"/>
-      <w:numFmt w:val="bullet"/>
-      <w:lvlText w:val=""/>
-      <w:lvlJc w:val="left"/>
-      <w:pPr>
-        <w:ind w:left="720" w:hanging="360"/>
-      </w:pPr>
-      <w:rPr>
-        <w:rFonts w:ascii="Symbol" w:hAnsi="Symbol" w:hint="default"/>
-      </w:rPr>
-    </w:lvl>
-    <w:lvl w:ilvl="1" w:tplc="0C0A0003" w:tentative="1">
-      <w:start w:val="1"/>
-      <w:numFmt w:val="bullet"/>
-      <w:lvlText w:val="o"/>
-      <w:lvlJc w:val="left"/>
-      <w:pPr>
-        <w:ind w:left="1440" w:hanging="360"/>
-      </w:pPr>
-      <w:rPr>
-        <w:rFonts w:ascii="Courier New" w:hAnsi="Courier New" w:cs="Courier New" w:hint="default"/>
-      </w:rPr>
-    </w:lvl>
-    <w:lvl w:ilvl="2" w:tplc="0C0A0005" w:tentative="1">
-      <w:start w:val="1"/>
-      <w:numFmt w:val="bullet"/>
-      <w:lvlText w:val=""/>
-      <w:lvlJc w:val="left"/>
-      <w:pPr>
-        <w:ind w:left="2160" w:hanging="360"/>
-      </w:pPr>
-      <w:rPr>
-        <w:rFonts w:ascii="Wingdings" w:hAnsi="Wingdings" w:hint="default"/>
-      </w:rPr>
-    </w:lvl>
-    <w:lvl w:ilvl="3" w:tplc="0C0A0001" w:tentative="1">
-      <w:start w:val="1"/>
-      <w:numFmt w:val="bullet"/>
-      <w:lvlText w:val=""/>
-      <w:lvlJc w:val="left"/>
-      <w:pPr>
-        <w:ind w:left="2880" w:hanging="360"/>
-      </w:pPr>
-      <w:rPr>
-        <w:rFonts w:ascii="Symbol" w:hAnsi="Symbol" w:hint="default"/>
-      </w:rPr>
-    </w:lvl>
-    <w:lvl w:ilvl="4" w:tplc="0C0A0003" w:tentative="1">
-      <w:start w:val="1"/>
-      <w:numFmt w:val="bullet"/>
-      <w:lvlText w:val="o"/>
-      <w:lvlJc w:val="left"/>
-      <w:pPr>
-        <w:ind w:left="3600" w:hanging="360"/>
-      </w:pPr>
-      <w:rPr>
-        <w:rFonts w:ascii="Courier New" w:hAnsi="Courier New" w:cs="Courier New" w:hint="default"/>
-      </w:rPr>
-    </w:lvl>
-    <w:lvl w:ilvl="5" w:tplc="0C0A0005" w:tentative="1">
-      <w:start w:val="1"/>
-      <w:numFmt w:val="bullet"/>
-      <w:lvlText w:val=""/>
-      <w:lvlJc w:val="left"/>
-      <w:pPr>
-        <w:ind w:left="4320" w:hanging="360"/>
-      </w:pPr>
-      <w:rPr>
-        <w:rFonts w:ascii="Wingdings" w:hAnsi="Wingdings" w:hint="default"/>
-      </w:rPr>
-    </w:lvl>
-    <w:lvl w:ilvl="6" w:tplc="0C0A0001" w:tentative="1">
-      <w:start w:val="1"/>
-      <w:numFmt w:val="bullet"/>
-      <w:lvlText w:val=""/>
-      <w:lvlJc w:val="left"/>
-      <w:pPr>
-        <w:ind w:left="5040" w:hanging="360"/>
-      </w:pPr>
-      <w:rPr>
-        <w:rFonts w:ascii="Symbol" w:hAnsi="Symbol" w:hint="default"/>
-      </w:rPr>
-    </w:lvl>
-    <w:lvl w:ilvl="7" w:tplc="0C0A0003" w:tentative="1">
-      <w:start w:val="1"/>
-      <w:numFmt w:val="bullet"/>
-      <w:lvlText w:val="o"/>
-      <w:lvlJc w:val="left"/>
-      <w:pPr>
-        <w:ind w:left="5760" w:hanging="360"/>
-      </w:pPr>
-      <w:rPr>
-        <w:rFonts w:ascii="Courier New" w:hAnsi="Courier New" w:cs="Courier New" w:hint="default"/>
-      </w:rPr>
-    </w:lvl>
-    <w:lvl w:ilvl="8" w:tplc="0C0A0005" w:tentative="1">
-      <w:start w:val="1"/>
-      <w:numFmt w:val="bullet"/>
-      <w:lvlText w:val=""/>
-      <w:lvlJc w:val="left"/>
-      <w:pPr>
-        <w:ind w:left="6480" w:hanging="360"/>
+    <w:tmpl w:val="5300A64A"/>
+    <w:lvl w:ilvl="0" w:tplc="040C0001">
+      <w:start w:val="1"/>
+      <w:numFmt w:val="bullet"/>
+      <w:lvlText w:val=""/>
+      <w:lvlJc w:val="left"/>
+      <w:pPr>
+        <w:ind w:left="2136" w:hanging="360"/>
+      </w:pPr>
+      <w:rPr>
+        <w:rFonts w:ascii="Symbol" w:hAnsi="Symbol" w:hint="default"/>
+      </w:rPr>
+    </w:lvl>
+    <w:lvl w:ilvl="1" w:tplc="040C0003" w:tentative="1">
+      <w:start w:val="1"/>
+      <w:numFmt w:val="bullet"/>
+      <w:lvlText w:val="o"/>
+      <w:lvlJc w:val="left"/>
+      <w:pPr>
+        <w:ind w:left="2856" w:hanging="360"/>
+      </w:pPr>
+      <w:rPr>
+        <w:rFonts w:ascii="Courier New" w:hAnsi="Courier New" w:cs="Courier New" w:hint="default"/>
+      </w:rPr>
+    </w:lvl>
+    <w:lvl w:ilvl="2" w:tplc="040C0005" w:tentative="1">
+      <w:start w:val="1"/>
+      <w:numFmt w:val="bullet"/>
+      <w:lvlText w:val=""/>
+      <w:lvlJc w:val="left"/>
+      <w:pPr>
+        <w:ind w:left="3576" w:hanging="360"/>
+      </w:pPr>
+      <w:rPr>
+        <w:rFonts w:ascii="Wingdings" w:hAnsi="Wingdings" w:hint="default"/>
+      </w:rPr>
+    </w:lvl>
+    <w:lvl w:ilvl="3" w:tplc="040C0001" w:tentative="1">
+      <w:start w:val="1"/>
+      <w:numFmt w:val="bullet"/>
+      <w:lvlText w:val=""/>
+      <w:lvlJc w:val="left"/>
+      <w:pPr>
+        <w:ind w:left="4296" w:hanging="360"/>
+      </w:pPr>
+      <w:rPr>
+        <w:rFonts w:ascii="Symbol" w:hAnsi="Symbol" w:hint="default"/>
+      </w:rPr>
+    </w:lvl>
+    <w:lvl w:ilvl="4" w:tplc="040C0003" w:tentative="1">
+      <w:start w:val="1"/>
+      <w:numFmt w:val="bullet"/>
+      <w:lvlText w:val="o"/>
+      <w:lvlJc w:val="left"/>
+      <w:pPr>
+        <w:ind w:left="5016" w:hanging="360"/>
+      </w:pPr>
+      <w:rPr>
+        <w:rFonts w:ascii="Courier New" w:hAnsi="Courier New" w:cs="Courier New" w:hint="default"/>
+      </w:rPr>
+    </w:lvl>
+    <w:lvl w:ilvl="5" w:tplc="040C0005" w:tentative="1">
+      <w:start w:val="1"/>
+      <w:numFmt w:val="bullet"/>
+      <w:lvlText w:val=""/>
+      <w:lvlJc w:val="left"/>
+      <w:pPr>
+        <w:ind w:left="5736" w:hanging="360"/>
+      </w:pPr>
+      <w:rPr>
+        <w:rFonts w:ascii="Wingdings" w:hAnsi="Wingdings" w:hint="default"/>
+      </w:rPr>
+    </w:lvl>
+    <w:lvl w:ilvl="6" w:tplc="040C0001" w:tentative="1">
+      <w:start w:val="1"/>
+      <w:numFmt w:val="bullet"/>
+      <w:lvlText w:val=""/>
+      <w:lvlJc w:val="left"/>
+      <w:pPr>
+        <w:ind w:left="6456" w:hanging="360"/>
+      </w:pPr>
+      <w:rPr>
+        <w:rFonts w:ascii="Symbol" w:hAnsi="Symbol" w:hint="default"/>
+      </w:rPr>
+    </w:lvl>
+    <w:lvl w:ilvl="7" w:tplc="040C0003" w:tentative="1">
+      <w:start w:val="1"/>
+      <w:numFmt w:val="bullet"/>
+      <w:lvlText w:val="o"/>
+      <w:lvlJc w:val="left"/>
+      <w:pPr>
+        <w:ind w:left="7176" w:hanging="360"/>
+      </w:pPr>
+      <w:rPr>
+        <w:rFonts w:ascii="Courier New" w:hAnsi="Courier New" w:cs="Courier New" w:hint="default"/>
+      </w:rPr>
+    </w:lvl>
+    <w:lvl w:ilvl="8" w:tplc="040C0005" w:tentative="1">
+      <w:start w:val="1"/>
+      <w:numFmt w:val="bullet"/>
+      <w:lvlText w:val=""/>
+      <w:lvlJc w:val="left"/>
+      <w:pPr>
+        <w:ind w:left="7896" w:hanging="360"/>
       </w:pPr>
       <w:rPr>
         <w:rFonts w:ascii="Wingdings" w:hAnsi="Wingdings" w:hint="default"/>
@@ -1064,43 +1177,46 @@
     </w:lvl>
   </w:abstractNum>
   <w:num w:numId="1" w16cid:durableId="760028956">
+    <w:abstractNumId w:val="4"/>
+  </w:num>
+  <w:num w:numId="2" w16cid:durableId="1786803593">
+    <w:abstractNumId w:val="4"/>
+  </w:num>
+  <w:num w:numId="3" w16cid:durableId="1483034804">
+    <w:abstractNumId w:val="4"/>
+  </w:num>
+  <w:num w:numId="4" w16cid:durableId="358237805">
+    <w:abstractNumId w:val="4"/>
+  </w:num>
+  <w:num w:numId="5" w16cid:durableId="762074375">
+    <w:abstractNumId w:val="2"/>
+  </w:num>
+  <w:num w:numId="6" w16cid:durableId="44761263">
+    <w:abstractNumId w:val="5"/>
+  </w:num>
+  <w:num w:numId="7" w16cid:durableId="188564522">
+    <w:abstractNumId w:val="6"/>
+  </w:num>
+  <w:num w:numId="8" w16cid:durableId="583104868">
+    <w:abstractNumId w:val="7"/>
+  </w:num>
+  <w:num w:numId="9" w16cid:durableId="674501961">
     <w:abstractNumId w:val="3"/>
   </w:num>
-  <w:num w:numId="2" w16cid:durableId="1786803593">
-    <w:abstractNumId w:val="3"/>
-  </w:num>
-  <w:num w:numId="3" w16cid:durableId="1483034804">
-    <w:abstractNumId w:val="3"/>
-  </w:num>
-  <w:num w:numId="4" w16cid:durableId="358237805">
-    <w:abstractNumId w:val="3"/>
-  </w:num>
-  <w:num w:numId="5" w16cid:durableId="762074375">
+  <w:num w:numId="10" w16cid:durableId="721443396">
     <w:abstractNumId w:val="1"/>
   </w:num>
-  <w:num w:numId="6" w16cid:durableId="44761263">
-    <w:abstractNumId w:val="4"/>
-  </w:num>
-  <w:num w:numId="7" w16cid:durableId="188564522">
-    <w:abstractNumId w:val="5"/>
-  </w:num>
-  <w:num w:numId="8" w16cid:durableId="583104868">
-    <w:abstractNumId w:val="6"/>
-  </w:num>
-  <w:num w:numId="9" w16cid:durableId="674501961">
-    <w:abstractNumId w:val="2"/>
-  </w:num>
-  <w:num w:numId="10" w16cid:durableId="721443396">
+  <w:num w:numId="11" w16cid:durableId="13460873">
     <w:abstractNumId w:val="0"/>
   </w:num>
-  <w:num w:numId="11">
-    <w:abstractNumId w:val="7"/>
+  <w:num w:numId="12">
+    <w:abstractNumId w:val="8"/>
   </w:num>
 </w:numbering>
 </file>
 
 <file path=word/styles.xml><?xml version="1.0" encoding="utf-8"?>
-<w:styles xmlns:mc="http://schemas.openxmlformats.org/markup-compatibility/2006" xmlns:r="http://schemas.openxmlformats.org/officeDocument/2006/relationships" xmlns:w="http://schemas.openxmlformats.org/wordprocessingml/2006/main" xmlns:w14="http://schemas.microsoft.com/office/word/2010/wordml" xmlns:w15="http://schemas.microsoft.com/office/word/2012/wordml" xmlns:w16cex="http://schemas.microsoft.com/office/word/2018/wordml/cex" xmlns:w16cid="http://schemas.microsoft.com/office/word/2016/wordml/cid" xmlns:w16="http://schemas.microsoft.com/office/word/2018/wordml" xmlns:w16du="http://schemas.microsoft.com/office/word/2023/wordml/word16du" xmlns:w16sdtdh="http://schemas.microsoft.com/office/word/2020/wordml/sdtdatahash" xmlns:w16se="http://schemas.microsoft.com/office/word/2015/wordml/symex" mc:Ignorable="w14 w15 w16se w16cid w16 w16cex w16sdtdh w16du">
+<w:styles xmlns:mc="http://schemas.openxmlformats.org/markup-compatibility/2006" xmlns:r="http://schemas.openxmlformats.org/officeDocument/2006/relationships" xmlns:w="http://schemas.openxmlformats.org/wordprocessingml/2006/main" xmlns:w14="http://schemas.microsoft.com/office/word/2010/wordml" xmlns:w15="http://schemas.microsoft.com/office/word/2012/wordml" xmlns:w16cex="http://schemas.microsoft.com/office/word/2018/wordml/cex" xmlns:w16cid="http://schemas.microsoft.com/office/word/2016/wordml/cid" xmlns:w16="http://schemas.microsoft.com/office/word/2018/wordml" xmlns:w16du="http://schemas.microsoft.com/office/word/2023/wordml/word16du" xmlns:w16sdtdh="http://schemas.microsoft.com/office/word/2020/wordml/sdtdatahash" xmlns:w16sdtfl="http://schemas.microsoft.com/office/word/2024/wordml/sdtformatlock" xmlns:w16se="http://schemas.microsoft.com/office/word/2015/wordml/symex" mc:Ignorable="w14 w15 w16se w16cid w16 w16cex w16sdtdh w16sdtfl w16du">
   <w:docDefaults>
     <w:rPrDefault>
       <w:rPr>
@@ -1503,10 +1619,10 @@
       <w:color w:val="595959" w:themeColor="text1" w:themeTint="A6"/>
     </w:rPr>
   </w:style>
-  <w:style w:type="paragraph" w:styleId="Ttulo1">
+  <w:style w:type="paragraph" w:styleId="Titre1">
     <w:name w:val="heading 1"/>
     <w:basedOn w:val="Normal"/>
-    <w:link w:val="Ttulo1Car"/>
+    <w:link w:val="Titre1Car"/>
     <w:uiPriority w:val="9"/>
     <w:qFormat/>
     <w:rsid w:val="005074E0"/>
@@ -1525,10 +1641,10 @@
       <w:lang w:eastAsia="fr-FR"/>
     </w:rPr>
   </w:style>
-  <w:style w:type="paragraph" w:styleId="Ttulo2">
+  <w:style w:type="paragraph" w:styleId="Titre2">
     <w:name w:val="heading 2"/>
     <w:basedOn w:val="Normal"/>
-    <w:link w:val="Ttulo2Car"/>
+    <w:link w:val="Titre2Car"/>
     <w:uiPriority w:val="9"/>
     <w:qFormat/>
     <w:rsid w:val="005074E0"/>
@@ -1545,10 +1661,10 @@
       <w:lang w:eastAsia="fr-FR"/>
     </w:rPr>
   </w:style>
-  <w:style w:type="paragraph" w:styleId="Ttulo3">
+  <w:style w:type="paragraph" w:styleId="Titre3">
     <w:name w:val="heading 3"/>
     <w:basedOn w:val="Normal"/>
-    <w:link w:val="Ttulo3Car"/>
+    <w:link w:val="Titre3Car"/>
     <w:uiPriority w:val="9"/>
     <w:qFormat/>
     <w:rsid w:val="005074E0"/>
@@ -1566,10 +1682,10 @@
       <w:lang w:eastAsia="fr-FR"/>
     </w:rPr>
   </w:style>
-  <w:style w:type="paragraph" w:styleId="Ttulo4">
+  <w:style w:type="paragraph" w:styleId="Titre4">
     <w:name w:val="heading 4"/>
     <w:basedOn w:val="Normal"/>
-    <w:link w:val="Ttulo4Car"/>
+    <w:link w:val="Titre4Car"/>
     <w:uiPriority w:val="9"/>
     <w:qFormat/>
     <w:rsid w:val="005074E0"/>
@@ -1587,11 +1703,11 @@
       <w:lang w:eastAsia="fr-FR"/>
     </w:rPr>
   </w:style>
-  <w:style w:type="paragraph" w:styleId="Ttulo5">
+  <w:style w:type="paragraph" w:styleId="Titre5">
     <w:name w:val="heading 5"/>
     <w:basedOn w:val="Normal"/>
     <w:next w:val="Normal"/>
-    <w:link w:val="Ttulo5Car"/>
+    <w:link w:val="Titre5Car"/>
     <w:uiPriority w:val="9"/>
     <w:unhideWhenUsed/>
     <w:qFormat/>
@@ -1607,13 +1723,13 @@
       <w:color w:val="243F60" w:themeColor="accent1" w:themeShade="7F"/>
     </w:rPr>
   </w:style>
-  <w:style w:type="character" w:default="1" w:styleId="Fuentedeprrafopredeter">
+  <w:style w:type="character" w:default="1" w:styleId="Policepardfaut">
     <w:name w:val="Default Paragraph Font"/>
     <w:uiPriority w:val="1"/>
     <w:semiHidden/>
     <w:unhideWhenUsed/>
   </w:style>
-  <w:style w:type="table" w:default="1" w:styleId="Tablanormal">
+  <w:style w:type="table" w:default="1" w:styleId="TableauNormal">
     <w:name w:val="Normal Table"/>
     <w:uiPriority w:val="99"/>
     <w:semiHidden/>
@@ -1628,16 +1744,16 @@
       </w:tblCellMar>
     </w:tblPr>
   </w:style>
-  <w:style w:type="numbering" w:default="1" w:styleId="Sinlista">
+  <w:style w:type="numbering" w:default="1" w:styleId="Aucuneliste">
     <w:name w:val="No List"/>
     <w:uiPriority w:val="99"/>
     <w:semiHidden/>
     <w:unhideWhenUsed/>
   </w:style>
-  <w:style w:type="character" w:customStyle="1" w:styleId="Ttulo1Car">
-    <w:name w:val="Título 1 Car"/>
-    <w:basedOn w:val="Fuentedeprrafopredeter"/>
-    <w:link w:val="Ttulo1"/>
+  <w:style w:type="character" w:customStyle="1" w:styleId="Titre1Car">
+    <w:name w:val="Titre 1 Car"/>
+    <w:basedOn w:val="Policepardfaut"/>
+    <w:link w:val="Titre1"/>
     <w:uiPriority w:val="9"/>
     <w:rsid w:val="005074E0"/>
     <w:rPr>
@@ -1650,10 +1766,10 @@
       <w:lang w:eastAsia="fr-FR"/>
     </w:rPr>
   </w:style>
-  <w:style w:type="character" w:customStyle="1" w:styleId="Ttulo2Car">
-    <w:name w:val="Título 2 Car"/>
-    <w:basedOn w:val="Fuentedeprrafopredeter"/>
-    <w:link w:val="Ttulo2"/>
+  <w:style w:type="character" w:customStyle="1" w:styleId="Titre2Car">
+    <w:name w:val="Titre 2 Car"/>
+    <w:basedOn w:val="Policepardfaut"/>
+    <w:link w:val="Titre2"/>
     <w:uiPriority w:val="9"/>
     <w:rsid w:val="005074E0"/>
     <w:rPr>
@@ -1666,10 +1782,10 @@
       <w:lang w:eastAsia="fr-FR"/>
     </w:rPr>
   </w:style>
-  <w:style w:type="character" w:customStyle="1" w:styleId="Ttulo3Car">
-    <w:name w:val="Título 3 Car"/>
-    <w:basedOn w:val="Fuentedeprrafopredeter"/>
-    <w:link w:val="Ttulo3"/>
+  <w:style w:type="character" w:customStyle="1" w:styleId="Titre3Car">
+    <w:name w:val="Titre 3 Car"/>
+    <w:basedOn w:val="Policepardfaut"/>
+    <w:link w:val="Titre3"/>
     <w:uiPriority w:val="9"/>
     <w:rsid w:val="005074E0"/>
     <w:rPr>
@@ -1681,10 +1797,10 @@
       <w:lang w:eastAsia="fr-FR"/>
     </w:rPr>
   </w:style>
-  <w:style w:type="character" w:customStyle="1" w:styleId="Ttulo4Car">
-    <w:name w:val="Título 4 Car"/>
-    <w:basedOn w:val="Fuentedeprrafopredeter"/>
-    <w:link w:val="Ttulo4"/>
+  <w:style w:type="character" w:customStyle="1" w:styleId="Titre4Car">
+    <w:name w:val="Titre 4 Car"/>
+    <w:basedOn w:val="Policepardfaut"/>
+    <w:link w:val="Titre4"/>
     <w:uiPriority w:val="9"/>
     <w:rsid w:val="005074E0"/>
     <w:rPr>
@@ -1696,9 +1812,9 @@
       <w:lang w:eastAsia="fr-FR"/>
     </w:rPr>
   </w:style>
-  <w:style w:type="character" w:styleId="Textoennegrita">
+  <w:style w:type="character" w:styleId="lev">
     <w:name w:val="Strong"/>
-    <w:basedOn w:val="Fuentedeprrafopredeter"/>
+    <w:basedOn w:val="Policepardfaut"/>
     <w:uiPriority w:val="22"/>
     <w:qFormat/>
     <w:rsid w:val="005074E0"/>
@@ -1707,9 +1823,9 @@
       <w:bCs/>
     </w:rPr>
   </w:style>
-  <w:style w:type="character" w:styleId="nfasis">
+  <w:style w:type="character" w:styleId="Accentuation">
     <w:name w:val="Emphasis"/>
-    <w:basedOn w:val="Fuentedeprrafopredeter"/>
+    <w:basedOn w:val="Policepardfaut"/>
     <w:uiPriority w:val="20"/>
     <w:qFormat/>
     <w:rsid w:val="005074E0"/>
@@ -1718,7 +1834,7 @@
       <w:iCs/>
     </w:rPr>
   </w:style>
-  <w:style w:type="paragraph" w:styleId="Prrafodelista">
+  <w:style w:type="paragraph" w:styleId="Paragraphedeliste">
     <w:name w:val="List Paragraph"/>
     <w:basedOn w:val="Normal"/>
     <w:uiPriority w:val="34"/>
@@ -1737,11 +1853,11 @@
       <w:lang w:val="en-US"/>
     </w:rPr>
   </w:style>
-  <w:style w:type="paragraph" w:styleId="Ttulo">
+  <w:style w:type="paragraph" w:styleId="Titre">
     <w:name w:val="Title"/>
     <w:basedOn w:val="Normal"/>
     <w:next w:val="Normal"/>
-    <w:link w:val="TtuloCar"/>
+    <w:link w:val="TitreCar"/>
     <w:uiPriority w:val="10"/>
     <w:qFormat/>
     <w:rsid w:val="005074E0"/>
@@ -1761,10 +1877,10 @@
       <w:szCs w:val="52"/>
     </w:rPr>
   </w:style>
-  <w:style w:type="character" w:customStyle="1" w:styleId="TtuloCar">
-    <w:name w:val="Título Car"/>
-    <w:basedOn w:val="Fuentedeprrafopredeter"/>
-    <w:link w:val="Ttulo"/>
+  <w:style w:type="character" w:customStyle="1" w:styleId="TitreCar">
+    <w:name w:val="Titre Car"/>
+    <w:basedOn w:val="Policepardfaut"/>
+    <w:link w:val="Titre"/>
     <w:uiPriority w:val="10"/>
     <w:rsid w:val="005074E0"/>
     <w:rPr>
@@ -1776,9 +1892,9 @@
       <w:szCs w:val="52"/>
     </w:rPr>
   </w:style>
-  <w:style w:type="table" w:styleId="Tablaconcuadrcula">
+  <w:style w:type="table" w:styleId="Grilledutableau">
     <w:name w:val="Table Grid"/>
-    <w:basedOn w:val="Tablanormal"/>
+    <w:basedOn w:val="TableauNormal"/>
     <w:uiPriority w:val="59"/>
     <w:rsid w:val="004709D7"/>
     <w:pPr>
@@ -1812,9 +1928,9 @@
       <w:lang w:eastAsia="fr-FR"/>
     </w:rPr>
   </w:style>
-  <w:style w:type="character" w:styleId="CdigoHTML">
+  <w:style w:type="character" w:styleId="CodeHTML">
     <w:name w:val="HTML Code"/>
-    <w:basedOn w:val="Fuentedeprrafopredeter"/>
+    <w:basedOn w:val="Policepardfaut"/>
     <w:uiPriority w:val="99"/>
     <w:semiHidden/>
     <w:unhideWhenUsed/>
@@ -1825,7 +1941,7 @@
       <w:szCs w:val="20"/>
     </w:rPr>
   </w:style>
-  <w:style w:type="paragraph" w:styleId="Sinespaciado">
+  <w:style w:type="paragraph" w:styleId="Sansinterligne">
     <w:name w:val="No Spacing"/>
     <w:uiPriority w:val="1"/>
     <w:qFormat/>
@@ -1838,9 +1954,9 @@
       <w:color w:val="595959" w:themeColor="text1" w:themeTint="A6"/>
     </w:rPr>
   </w:style>
-  <w:style w:type="character" w:styleId="Hipervnculo">
+  <w:style w:type="character" w:styleId="Lienhypertexte">
     <w:name w:val="Hyperlink"/>
-    <w:basedOn w:val="Fuentedeprrafopredeter"/>
+    <w:basedOn w:val="Policepardfaut"/>
     <w:uiPriority w:val="99"/>
     <w:unhideWhenUsed/>
     <w:rsid w:val="00830BD7"/>
@@ -1849,10 +1965,10 @@
       <w:u w:val="single"/>
     </w:rPr>
   </w:style>
-  <w:style w:type="character" w:customStyle="1" w:styleId="Ttulo5Car">
-    <w:name w:val="Título 5 Car"/>
-    <w:basedOn w:val="Fuentedeprrafopredeter"/>
-    <w:link w:val="Ttulo5"/>
+  <w:style w:type="character" w:customStyle="1" w:styleId="Titre5Car">
+    <w:name w:val="Titre 5 Car"/>
+    <w:basedOn w:val="Policepardfaut"/>
+    <w:link w:val="Titre5"/>
     <w:uiPriority w:val="9"/>
     <w:rsid w:val="000153F5"/>
     <w:rPr>

</xml_diff>